<commit_message>
Finalize Week 3 literature review updates
</commit_message>
<xml_diff>
--- a/paper/literature_review.docx
+++ b/paper/literature_review.docx
@@ -1658,65 +1658,15 @@
               <w:ind w:left="10" w:right="33"/>
               <w:rPr>
                 <w:sz w:val="20"/>
+                <w:lang w:val="en-IN"/>
               </w:rPr>
             </w:pPr>
             <w:r>
               <w:rPr>
                 <w:sz w:val="20"/>
-              </w:rPr>
-              <w:t>Putra</w:t>
-            </w:r>
-            <w:r>
-              <w:rPr>
-                <w:spacing w:val="-10"/>
-                <w:sz w:val="20"/>
-              </w:rPr>
-              <w:t xml:space="preserve"> </w:t>
-            </w:r>
-            <w:r>
-              <w:rPr>
-                <w:sz w:val="20"/>
-              </w:rPr>
-              <w:t>et</w:t>
-            </w:r>
-            <w:r>
-              <w:rPr>
-                <w:spacing w:val="-10"/>
-                <w:sz w:val="20"/>
-              </w:rPr>
-              <w:t xml:space="preserve"> </w:t>
-            </w:r>
-            <w:r>
-              <w:rPr>
-                <w:sz w:val="20"/>
-              </w:rPr>
-              <w:t>al.,</w:t>
-            </w:r>
-            <w:r>
-              <w:rPr>
-                <w:spacing w:val="-10"/>
-                <w:sz w:val="20"/>
-              </w:rPr>
-              <w:t xml:space="preserve"> </w:t>
-            </w:r>
-            <w:r>
-              <w:rPr>
-                <w:sz w:val="20"/>
-              </w:rPr>
-              <w:t>“Comparison</w:t>
-            </w:r>
-            <w:r>
-              <w:rPr>
-                <w:spacing w:val="-10"/>
-                <w:sz w:val="20"/>
-              </w:rPr>
-              <w:t xml:space="preserve"> </w:t>
-            </w:r>
-            <w:r>
-              <w:rPr>
-                <w:sz w:val="20"/>
-              </w:rPr>
-              <w:t>of Breadth-First Search (BFS) and Depth-First Search (DFS) Algorithms for Shortest Search in Campus Maze” (2025)</w:t>
+                <w:lang w:val="en-IN"/>
+              </w:rPr>
+              <w:t>Putra et al., "Comparison of Breadth-First Search (BFS) and Depth-First Search (DFS) Algorithms for Shortest Search in Campus Labyrinth" (2025)</w:t>
             </w:r>
           </w:p>
         </w:tc>
@@ -1730,177 +1680,25 @@
               <w:ind w:left="12" w:right="19"/>
               <w:rPr>
                 <w:sz w:val="20"/>
+                <w:lang w:val="en-IN"/>
               </w:rPr>
             </w:pPr>
             <w:r>
               <w:rPr>
                 <w:sz w:val="20"/>
-              </w:rPr>
-              <w:t>Compared</w:t>
-            </w:r>
-            <w:r>
-              <w:rPr>
-                <w:spacing w:val="-7"/>
+                <w:lang w:val="en-IN"/>
+              </w:rPr>
+              <w:t>Compared BFS and DFS in a graph-based simulation of a campus maze, evaluating execution speed, memory usage, and shortest-path behaviour.</w:t>
+            </w:r>
+          </w:p>
+          <w:p>
+            <w:pPr>
+              <w:pStyle w:val="TableParagraph"/>
+              <w:ind w:left="12" w:right="19"/>
+              <w:rPr>
                 <w:sz w:val="20"/>
               </w:rPr>
-              <w:t xml:space="preserve"> </w:t>
-            </w:r>
-            <w:r>
-              <w:rPr>
-                <w:sz w:val="20"/>
-              </w:rPr>
-              <w:t>BFS</w:t>
-            </w:r>
-            <w:r>
-              <w:rPr>
-                <w:spacing w:val="-8"/>
-                <w:sz w:val="20"/>
-              </w:rPr>
-              <w:t xml:space="preserve"> </w:t>
-            </w:r>
-            <w:r>
-              <w:rPr>
-                <w:sz w:val="20"/>
-              </w:rPr>
-              <w:t>and</w:t>
-            </w:r>
-            <w:r>
-              <w:rPr>
-                <w:spacing w:val="-7"/>
-                <w:sz w:val="20"/>
-              </w:rPr>
-              <w:t xml:space="preserve"> </w:t>
-            </w:r>
-            <w:r>
-              <w:rPr>
-                <w:sz w:val="20"/>
-              </w:rPr>
-              <w:t>DFS</w:t>
-            </w:r>
-            <w:r>
-              <w:rPr>
-                <w:spacing w:val="-8"/>
-                <w:sz w:val="20"/>
-              </w:rPr>
-              <w:t xml:space="preserve"> </w:t>
-            </w:r>
-            <w:r>
-              <w:rPr>
-                <w:sz w:val="20"/>
-              </w:rPr>
-              <w:t>in</w:t>
-            </w:r>
-            <w:r>
-              <w:rPr>
-                <w:spacing w:val="-7"/>
-                <w:sz w:val="20"/>
-              </w:rPr>
-              <w:t xml:space="preserve"> </w:t>
-            </w:r>
-            <w:r>
-              <w:rPr>
-                <w:sz w:val="20"/>
-              </w:rPr>
-              <w:t>a</w:t>
-            </w:r>
-            <w:r>
-              <w:rPr>
-                <w:spacing w:val="-8"/>
-                <w:sz w:val="20"/>
-              </w:rPr>
-              <w:t xml:space="preserve"> </w:t>
-            </w:r>
-            <w:r>
-              <w:rPr>
-                <w:sz w:val="20"/>
-              </w:rPr>
-              <w:t>graph-based</w:t>
-            </w:r>
-            <w:r>
-              <w:rPr>
-                <w:spacing w:val="-4"/>
-                <w:sz w:val="20"/>
-              </w:rPr>
-              <w:t xml:space="preserve"> </w:t>
-            </w:r>
-            <w:r>
-              <w:rPr>
-                <w:sz w:val="20"/>
-              </w:rPr>
-              <w:t>simulation</w:t>
-            </w:r>
-            <w:r>
-              <w:rPr>
-                <w:spacing w:val="-4"/>
-                <w:sz w:val="20"/>
-              </w:rPr>
-              <w:t xml:space="preserve"> </w:t>
-            </w:r>
-            <w:r>
-              <w:rPr>
-                <w:sz w:val="20"/>
-              </w:rPr>
-              <w:t>of</w:t>
-            </w:r>
-            <w:r>
-              <w:rPr>
-                <w:spacing w:val="-4"/>
-                <w:sz w:val="20"/>
-              </w:rPr>
-              <w:t xml:space="preserve"> </w:t>
-            </w:r>
-            <w:r>
-              <w:rPr>
-                <w:sz w:val="20"/>
-              </w:rPr>
-              <w:t>a</w:t>
-            </w:r>
-            <w:r>
-              <w:rPr>
-                <w:spacing w:val="-4"/>
-                <w:sz w:val="20"/>
-              </w:rPr>
-              <w:t xml:space="preserve"> </w:t>
-            </w:r>
-            <w:r>
-              <w:rPr>
-                <w:sz w:val="20"/>
-              </w:rPr>
-              <w:t>campus</w:t>
-            </w:r>
-            <w:r>
-              <w:rPr>
-                <w:spacing w:val="-5"/>
-                <w:sz w:val="20"/>
-              </w:rPr>
-              <w:t xml:space="preserve"> </w:t>
-            </w:r>
-            <w:r>
-              <w:rPr>
-                <w:sz w:val="20"/>
-              </w:rPr>
-              <w:t>maze, evaluating execution speed,</w:t>
-            </w:r>
-            <w:r>
-              <w:rPr>
-                <w:spacing w:val="40"/>
-                <w:sz w:val="20"/>
-              </w:rPr>
-              <w:t xml:space="preserve"> </w:t>
-            </w:r>
-            <w:r>
-              <w:rPr>
-                <w:sz w:val="20"/>
-              </w:rPr>
-              <w:t xml:space="preserve">memory usage, and processor </w:t>
-            </w:r>
-            <w:r>
-              <w:rPr>
-                <w:spacing w:val="-2"/>
-                <w:sz w:val="20"/>
-              </w:rPr>
-              <w:t>efficiency.</w:t>
-            </w:r>
+            </w:pPr>
           </w:p>
         </w:tc>
         <w:tc>
@@ -1912,40 +1710,24 @@
               <w:pStyle w:val="TableParagraph"/>
               <w:rPr>
                 <w:sz w:val="20"/>
+                <w:lang w:val="en-IN"/>
               </w:rPr>
             </w:pPr>
             <w:r>
               <w:rPr>
                 <w:sz w:val="20"/>
-              </w:rPr>
-              <w:t>Campus</w:t>
-            </w:r>
-            <w:r>
-              <w:rPr>
-                <w:spacing w:val="-13"/>
+                <w:lang w:val="en-IN"/>
+              </w:rPr>
+              <w:t>Campus layout represented as a graph. The exact number of nodes should be confirmed from the full paper before reporting it.</w:t>
+            </w:r>
+          </w:p>
+          <w:p>
+            <w:pPr>
+              <w:pStyle w:val="TableParagraph"/>
+              <w:rPr>
                 <w:sz w:val="20"/>
               </w:rPr>
-              <w:t xml:space="preserve"> </w:t>
-            </w:r>
-            <w:r>
-              <w:rPr>
-                <w:sz w:val="20"/>
-              </w:rPr>
-              <w:t>layout</w:t>
-            </w:r>
-            <w:r>
-              <w:rPr>
-                <w:spacing w:val="-12"/>
-                <w:sz w:val="20"/>
-              </w:rPr>
-              <w:t xml:space="preserve"> </w:t>
-            </w:r>
-            <w:r>
-              <w:rPr>
-                <w:sz w:val="20"/>
-              </w:rPr>
-              <w:t>represented as an unweighted graph with 20 room/location nodes; field-survey and secondary map data.</w:t>
-            </w:r>
+            </w:pPr>
           </w:p>
         </w:tc>
         <w:tc>
@@ -1958,170 +1740,25 @@
               <w:ind w:left="12"/>
               <w:rPr>
                 <w:sz w:val="20"/>
+                <w:lang w:val="en-IN"/>
               </w:rPr>
             </w:pPr>
             <w:r>
               <w:rPr>
                 <w:sz w:val="20"/>
-              </w:rPr>
-              <w:t>The</w:t>
-            </w:r>
-            <w:r>
-              <w:rPr>
-                <w:spacing w:val="-8"/>
+                <w:lang w:val="en-IN"/>
+              </w:rPr>
+              <w:t>The authors report that DFS has advantages in execution speed and memory usage, while BFS is more consistent in finding optimal/shortest paths.</w:t>
+            </w:r>
+          </w:p>
+          <w:p>
+            <w:pPr>
+              <w:pStyle w:val="TableParagraph"/>
+              <w:ind w:left="12"/>
+              <w:rPr>
                 <w:sz w:val="20"/>
               </w:rPr>
-              <w:t xml:space="preserve"> </w:t>
-            </w:r>
-            <w:r>
-              <w:rPr>
-                <w:sz w:val="20"/>
-              </w:rPr>
-              <w:t>authors</w:t>
-            </w:r>
-            <w:r>
-              <w:rPr>
-                <w:spacing w:val="-8"/>
-                <w:sz w:val="20"/>
-              </w:rPr>
-              <w:t xml:space="preserve"> </w:t>
-            </w:r>
-            <w:r>
-              <w:rPr>
-                <w:sz w:val="20"/>
-              </w:rPr>
-              <w:t>report</w:t>
-            </w:r>
-            <w:r>
-              <w:rPr>
-                <w:spacing w:val="-7"/>
-                <w:sz w:val="20"/>
-              </w:rPr>
-              <w:t xml:space="preserve"> </w:t>
-            </w:r>
-            <w:r>
-              <w:rPr>
-                <w:sz w:val="20"/>
-              </w:rPr>
-              <w:t>that</w:t>
-            </w:r>
-            <w:r>
-              <w:rPr>
-                <w:spacing w:val="-7"/>
-                <w:sz w:val="20"/>
-              </w:rPr>
-              <w:t xml:space="preserve"> </w:t>
-            </w:r>
-            <w:r>
-              <w:rPr>
-                <w:sz w:val="20"/>
-              </w:rPr>
-              <w:t>DFS</w:t>
-            </w:r>
-            <w:r>
-              <w:rPr>
-                <w:spacing w:val="-7"/>
-                <w:sz w:val="20"/>
-              </w:rPr>
-              <w:t xml:space="preserve"> </w:t>
-            </w:r>
-            <w:r>
-              <w:rPr>
-                <w:sz w:val="20"/>
-              </w:rPr>
-              <w:t>is</w:t>
-            </w:r>
-            <w:r>
-              <w:rPr>
-                <w:spacing w:val="-8"/>
-                <w:sz w:val="20"/>
-              </w:rPr>
-              <w:t xml:space="preserve"> </w:t>
-            </w:r>
-            <w:r>
-              <w:rPr>
-                <w:sz w:val="20"/>
-              </w:rPr>
-              <w:t>faster and</w:t>
-            </w:r>
-            <w:r>
-              <w:rPr>
-                <w:spacing w:val="-1"/>
-                <w:sz w:val="20"/>
-              </w:rPr>
-              <w:t xml:space="preserve"> </w:t>
-            </w:r>
-            <w:r>
-              <w:rPr>
-                <w:sz w:val="20"/>
-              </w:rPr>
-              <w:t>uses</w:t>
-            </w:r>
-            <w:r>
-              <w:rPr>
-                <w:spacing w:val="-2"/>
-                <w:sz w:val="20"/>
-              </w:rPr>
-              <w:t xml:space="preserve"> </w:t>
-            </w:r>
-            <w:r>
-              <w:rPr>
-                <w:sz w:val="20"/>
-              </w:rPr>
-              <w:t>less</w:t>
-            </w:r>
-            <w:r>
-              <w:rPr>
-                <w:spacing w:val="-2"/>
-                <w:sz w:val="20"/>
-              </w:rPr>
-              <w:t xml:space="preserve"> </w:t>
-            </w:r>
-            <w:r>
-              <w:rPr>
-                <w:sz w:val="20"/>
-              </w:rPr>
-              <w:t>memory,</w:t>
-            </w:r>
-            <w:r>
-              <w:rPr>
-                <w:spacing w:val="-1"/>
-                <w:sz w:val="20"/>
-              </w:rPr>
-              <w:t xml:space="preserve"> </w:t>
-            </w:r>
-            <w:r>
-              <w:rPr>
-                <w:sz w:val="20"/>
-              </w:rPr>
-              <w:t>while</w:t>
-            </w:r>
-            <w:r>
-              <w:rPr>
-                <w:spacing w:val="-1"/>
-                <w:sz w:val="20"/>
-              </w:rPr>
-              <w:t xml:space="preserve"> </w:t>
-            </w:r>
-            <w:r>
-              <w:rPr>
-                <w:sz w:val="20"/>
-              </w:rPr>
-              <w:t>BFS</w:t>
-            </w:r>
-            <w:r>
-              <w:rPr>
-                <w:spacing w:val="-2"/>
-                <w:sz w:val="20"/>
-              </w:rPr>
-              <w:t xml:space="preserve"> </w:t>
-            </w:r>
-            <w:r>
-              <w:rPr>
-                <w:sz w:val="20"/>
-              </w:rPr>
-              <w:t>is more consistent at finding optimal/shortest paths.</w:t>
-            </w:r>
+            </w:pPr>
           </w:p>
         </w:tc>
         <w:tc>
@@ -2133,79 +1770,24 @@
               <w:pStyle w:val="TableParagraph"/>
               <w:rPr>
                 <w:sz w:val="20"/>
+                <w:lang w:val="en-IN"/>
               </w:rPr>
             </w:pPr>
             <w:r>
               <w:rPr>
                 <w:sz w:val="20"/>
-              </w:rPr>
-              <w:t>Directly supports our BFS-versus-DFS baseline; compare path length, nodes expanded,</w:t>
-            </w:r>
-            <w:r>
-              <w:rPr>
-                <w:spacing w:val="-9"/>
+                <w:lang w:val="en-IN"/>
+              </w:rPr>
+              <w:t>Use this study to support our BFS-versus-DFS comparison. Measure path length, nodes expanded, runtime, and memory on our generated mazes.</w:t>
+            </w:r>
+          </w:p>
+          <w:p>
+            <w:pPr>
+              <w:pStyle w:val="TableParagraph"/>
+              <w:rPr>
                 <w:sz w:val="20"/>
               </w:rPr>
-              <w:t xml:space="preserve"> </w:t>
-            </w:r>
-            <w:r>
-              <w:rPr>
-                <w:sz w:val="20"/>
-              </w:rPr>
-              <w:t>runtime,</w:t>
-            </w:r>
-            <w:r>
-              <w:rPr>
-                <w:spacing w:val="-9"/>
-                <w:sz w:val="20"/>
-              </w:rPr>
-              <w:t xml:space="preserve"> </w:t>
-            </w:r>
-            <w:r>
-              <w:rPr>
-                <w:sz w:val="20"/>
-              </w:rPr>
-              <w:t>and</w:t>
-            </w:r>
-            <w:r>
-              <w:rPr>
-                <w:spacing w:val="-9"/>
-                <w:sz w:val="20"/>
-              </w:rPr>
-              <w:t xml:space="preserve"> </w:t>
-            </w:r>
-            <w:r>
-              <w:rPr>
-                <w:sz w:val="20"/>
-              </w:rPr>
-              <w:t>memory</w:t>
-            </w:r>
-            <w:r>
-              <w:rPr>
-                <w:spacing w:val="-9"/>
-                <w:sz w:val="20"/>
-              </w:rPr>
-              <w:t xml:space="preserve"> </w:t>
-            </w:r>
-            <w:r>
-              <w:rPr>
-                <w:sz w:val="20"/>
-              </w:rPr>
-              <w:t>on</w:t>
-            </w:r>
-            <w:r>
-              <w:rPr>
-                <w:spacing w:val="-9"/>
-                <w:sz w:val="20"/>
-              </w:rPr>
-              <w:t xml:space="preserve"> </w:t>
-            </w:r>
-            <w:r>
-              <w:rPr>
-                <w:sz w:val="20"/>
-              </w:rPr>
-              <w:t>our generated mazes.</w:t>
-            </w:r>
+            </w:pPr>
           </w:p>
         </w:tc>
       </w:tr>
@@ -5236,52 +4818,15 @@
               <w:ind w:left="10"/>
               <w:rPr>
                 <w:sz w:val="20"/>
+                <w:lang w:val="en-IN"/>
               </w:rPr>
             </w:pPr>
             <w:r>
               <w:rPr>
                 <w:sz w:val="20"/>
-              </w:rPr>
-              <w:t>Elkari et al., “Exploring Maze Navigation: A Comparative</w:t>
-            </w:r>
-            <w:r>
-              <w:rPr>
-                <w:spacing w:val="-13"/>
-                <w:sz w:val="20"/>
-              </w:rPr>
-              <w:t xml:space="preserve"> </w:t>
-            </w:r>
-            <w:r>
-              <w:rPr>
-                <w:sz w:val="20"/>
-              </w:rPr>
-              <w:t>Study</w:t>
-            </w:r>
-            <w:r>
-              <w:rPr>
-                <w:spacing w:val="-12"/>
-                <w:sz w:val="20"/>
-              </w:rPr>
-              <w:t xml:space="preserve"> </w:t>
-            </w:r>
-            <w:r>
-              <w:rPr>
-                <w:sz w:val="20"/>
-              </w:rPr>
-              <w:t>of</w:t>
-            </w:r>
-            <w:r>
-              <w:rPr>
-                <w:spacing w:val="-13"/>
-                <w:sz w:val="20"/>
-              </w:rPr>
-              <w:t xml:space="preserve"> </w:t>
-            </w:r>
-            <w:r>
-              <w:rPr>
-                <w:sz w:val="20"/>
-              </w:rPr>
-              <w:t>DFS, BFS, and A* Search Algorithms” (2024)</w:t>
+                <w:lang w:val="en-IN"/>
+              </w:rPr>
+              <w:t>Elkari et al., "Exploring Maze Navigation: A Comparative Study of DFS, BFS, and A* Search Algorithms" (2024)</w:t>
             </w:r>
           </w:p>
         </w:tc>
@@ -5296,86 +4841,26 @@
               <w:ind w:left="12"/>
               <w:rPr>
                 <w:sz w:val="20"/>
+                <w:lang w:val="en-IN"/>
               </w:rPr>
             </w:pPr>
             <w:r>
               <w:rPr>
                 <w:sz w:val="20"/>
-              </w:rPr>
-              <w:t>Compared DFS, BFS, and A* for maze path planning using Python and</w:t>
-            </w:r>
-            <w:r>
-              <w:rPr>
-                <w:spacing w:val="-9"/>
+                <w:lang w:val="en-IN"/>
+              </w:rPr>
+              <w:t>Compared DFS, BFS, and A* for maze path planning using Python and the Pmaze library, focusing on path cost and algorithmic complexity.</w:t>
+            </w:r>
+          </w:p>
+          <w:p>
+            <w:pPr>
+              <w:pStyle w:val="TableParagraph"/>
+              <w:spacing w:line="232" w:lineRule="exact"/>
+              <w:ind w:left="12"/>
+              <w:rPr>
                 <w:sz w:val="20"/>
               </w:rPr>
-              <w:t xml:space="preserve"> </w:t>
-            </w:r>
-            <w:r>
-              <w:rPr>
-                <w:sz w:val="20"/>
-              </w:rPr>
-              <w:t>the</w:t>
-            </w:r>
-            <w:r>
-              <w:rPr>
-                <w:spacing w:val="-9"/>
-                <w:sz w:val="20"/>
-              </w:rPr>
-              <w:t xml:space="preserve"> </w:t>
-            </w:r>
-            <w:r>
-              <w:rPr>
-                <w:sz w:val="20"/>
-              </w:rPr>
-              <w:t>Pmaze</w:t>
-            </w:r>
-            <w:r>
-              <w:rPr>
-                <w:spacing w:val="-9"/>
-                <w:sz w:val="20"/>
-              </w:rPr>
-              <w:t xml:space="preserve"> </w:t>
-            </w:r>
-            <w:r>
-              <w:rPr>
-                <w:sz w:val="20"/>
-              </w:rPr>
-              <w:t>library,</w:t>
-            </w:r>
-            <w:r>
-              <w:rPr>
-                <w:spacing w:val="-9"/>
-                <w:sz w:val="20"/>
-              </w:rPr>
-              <w:t xml:space="preserve"> </w:t>
-            </w:r>
-            <w:r>
-              <w:rPr>
-                <w:sz w:val="20"/>
-              </w:rPr>
-              <w:t>focusing</w:t>
-            </w:r>
-            <w:r>
-              <w:rPr>
-                <w:spacing w:val="-9"/>
-                <w:sz w:val="20"/>
-              </w:rPr>
-              <w:t xml:space="preserve"> </w:t>
-            </w:r>
-            <w:r>
-              <w:rPr>
-                <w:sz w:val="20"/>
-              </w:rPr>
-              <w:t xml:space="preserve">on path cost and algorithmic </w:t>
-            </w:r>
-            <w:r>
-              <w:rPr>
-                <w:spacing w:val="-2"/>
-                <w:sz w:val="20"/>
-              </w:rPr>
-              <w:t>complexity.</w:t>
-            </w:r>
+            </w:pPr>
           </w:p>
         </w:tc>
         <w:tc>
@@ -5393,34 +4878,9 @@
             <w:r>
               <w:rPr>
                 <w:sz w:val="20"/>
-              </w:rPr>
-              <w:t>Generated maze configurations with dead ends, loops, and multiple paths;</w:t>
-            </w:r>
-            <w:r>
-              <w:rPr>
-                <w:spacing w:val="-13"/>
-                <w:sz w:val="20"/>
-              </w:rPr>
-              <w:t xml:space="preserve"> </w:t>
-            </w:r>
-            <w:r>
-              <w:rPr>
-                <w:sz w:val="20"/>
-              </w:rPr>
-              <w:t>software</w:t>
-            </w:r>
-            <w:r>
-              <w:rPr>
-                <w:spacing w:val="-12"/>
-                <w:sz w:val="20"/>
-              </w:rPr>
-              <w:t xml:space="preserve"> </w:t>
-            </w:r>
-            <w:r>
-              <w:rPr>
-                <w:sz w:val="20"/>
-              </w:rPr>
-              <w:t>simulation, no physical robot.</w:t>
+                <w:lang w:val="en-IN"/>
+              </w:rPr>
+              <w:t>Simulated maze configurations evaluated using Python and Pmaze; no physical robot was used.</w:t>
             </w:r>
           </w:p>
         </w:tc>
@@ -5432,69 +4892,28 @@
             <w:pPr>
               <w:pStyle w:val="TableParagraph"/>
               <w:spacing w:line="232" w:lineRule="exact"/>
+              <w:rPr>
+                <w:sz w:val="20"/>
+                <w:lang w:val="en-IN"/>
+              </w:rPr>
+            </w:pPr>
+            <w:r>
+              <w:rPr>
+                <w:sz w:val="20"/>
+                <w:lang w:val="en-IN"/>
+              </w:rPr>
+              <w:t xml:space="preserve"> The study compares the algorithms' path costs and computational behaviour across maze scenarios. Its abstract does not state one universal winner or provide exact numerical results.</w:t>
+            </w:r>
+          </w:p>
+          <w:p>
+            <w:pPr>
+              <w:pStyle w:val="TableParagraph"/>
+              <w:spacing w:line="232" w:lineRule="exact"/>
               <w:ind w:left="12"/>
               <w:rPr>
                 <w:sz w:val="20"/>
               </w:rPr>
             </w:pPr>
-            <w:r>
-              <w:rPr>
-                <w:sz w:val="20"/>
-              </w:rPr>
-              <w:t>Studies</w:t>
-            </w:r>
-            <w:r>
-              <w:rPr>
-                <w:spacing w:val="-11"/>
-                <w:sz w:val="20"/>
-              </w:rPr>
-              <w:t xml:space="preserve"> </w:t>
-            </w:r>
-            <w:r>
-              <w:rPr>
-                <w:sz w:val="20"/>
-              </w:rPr>
-              <w:t>the</w:t>
-            </w:r>
-            <w:r>
-              <w:rPr>
-                <w:spacing w:val="-10"/>
-                <w:sz w:val="20"/>
-              </w:rPr>
-              <w:t xml:space="preserve"> </w:t>
-            </w:r>
-            <w:r>
-              <w:rPr>
-                <w:sz w:val="20"/>
-              </w:rPr>
-              <w:t>trade-offs</w:t>
-            </w:r>
-            <w:r>
-              <w:rPr>
-                <w:spacing w:val="-11"/>
-                <w:sz w:val="20"/>
-              </w:rPr>
-              <w:t xml:space="preserve"> </w:t>
-            </w:r>
-            <w:r>
-              <w:rPr>
-                <w:sz w:val="20"/>
-              </w:rPr>
-              <w:t>among</w:t>
-            </w:r>
-            <w:r>
-              <w:rPr>
-                <w:spacing w:val="-10"/>
-                <w:sz w:val="20"/>
-              </w:rPr>
-              <w:t xml:space="preserve"> </w:t>
-            </w:r>
-            <w:r>
-              <w:rPr>
-                <w:sz w:val="20"/>
-              </w:rPr>
-              <w:t>DFS, BFS, and A* in maze navigation; BFS explores level by level, DFS follows branches and backtracks, while A* uses a heuristic.</w:t>
-            </w:r>
           </w:p>
         </w:tc>
         <w:tc>
@@ -5508,157 +4927,26 @@
               <w:ind w:right="243"/>
               <w:rPr>
                 <w:sz w:val="20"/>
+                <w:lang w:val="en-IN"/>
               </w:rPr>
             </w:pPr>
             <w:r>
               <w:rPr>
                 <w:sz w:val="20"/>
-              </w:rPr>
-              <w:t>Closest</w:t>
-            </w:r>
-            <w:r>
-              <w:rPr>
-                <w:spacing w:val="-11"/>
+                <w:lang w:val="en-IN"/>
+              </w:rPr>
+              <w:t>Use its comparative approach to evaluate path length, nodes expanded, runtime, and performance across maze sizes in our own experiments.</w:t>
+            </w:r>
+          </w:p>
+          <w:p>
+            <w:pPr>
+              <w:pStyle w:val="TableParagraph"/>
+              <w:spacing w:line="232" w:lineRule="exact"/>
+              <w:ind w:right="243"/>
+              <w:rPr>
                 <w:sz w:val="20"/>
               </w:rPr>
-              <w:t xml:space="preserve"> </w:t>
-            </w:r>
-            <w:r>
-              <w:rPr>
-                <w:sz w:val="20"/>
-              </w:rPr>
-              <w:t>direct</w:t>
-            </w:r>
-            <w:r>
-              <w:rPr>
-                <w:spacing w:val="-11"/>
-                <w:sz w:val="20"/>
-              </w:rPr>
-              <w:t xml:space="preserve"> </w:t>
-            </w:r>
-            <w:r>
-              <w:rPr>
-                <w:sz w:val="20"/>
-              </w:rPr>
-              <w:t>methodological</w:t>
-            </w:r>
-            <w:r>
-              <w:rPr>
-                <w:spacing w:val="-11"/>
-                <w:sz w:val="20"/>
-              </w:rPr>
-              <w:t xml:space="preserve"> </w:t>
-            </w:r>
-            <w:r>
-              <w:rPr>
-                <w:sz w:val="20"/>
-              </w:rPr>
-              <w:t>match for our project; use its comparison structure</w:t>
-            </w:r>
-            <w:r>
-              <w:rPr>
-                <w:spacing w:val="-11"/>
-                <w:sz w:val="20"/>
-              </w:rPr>
-              <w:t xml:space="preserve"> </w:t>
-            </w:r>
-            <w:r>
-              <w:rPr>
-                <w:sz w:val="20"/>
-              </w:rPr>
-              <w:t>and</w:t>
-            </w:r>
-            <w:r>
-              <w:rPr>
-                <w:spacing w:val="-11"/>
-                <w:sz w:val="20"/>
-              </w:rPr>
-              <w:t xml:space="preserve"> </w:t>
-            </w:r>
-            <w:r>
-              <w:rPr>
-                <w:sz w:val="20"/>
-              </w:rPr>
-              <w:t>report</w:t>
-            </w:r>
-            <w:r>
-              <w:rPr>
-                <w:spacing w:val="-11"/>
-                <w:sz w:val="20"/>
-              </w:rPr>
-              <w:t xml:space="preserve"> </w:t>
-            </w:r>
-            <w:r>
-              <w:rPr>
-                <w:sz w:val="20"/>
-              </w:rPr>
-              <w:t>path</w:t>
-            </w:r>
-            <w:r>
-              <w:rPr>
-                <w:spacing w:val="-11"/>
-                <w:sz w:val="20"/>
-              </w:rPr>
-              <w:t xml:space="preserve"> </w:t>
-            </w:r>
-            <w:r>
-              <w:rPr>
-                <w:sz w:val="20"/>
-              </w:rPr>
-              <w:t>length/cost, nodes</w:t>
-            </w:r>
-            <w:r>
-              <w:rPr>
-                <w:spacing w:val="-10"/>
-                <w:sz w:val="20"/>
-              </w:rPr>
-              <w:t xml:space="preserve"> </w:t>
-            </w:r>
-            <w:r>
-              <w:rPr>
-                <w:sz w:val="20"/>
-              </w:rPr>
-              <w:t>expanded,</w:t>
-            </w:r>
-            <w:r>
-              <w:rPr>
-                <w:spacing w:val="-9"/>
-                <w:sz w:val="20"/>
-              </w:rPr>
-              <w:t xml:space="preserve"> </w:t>
-            </w:r>
-            <w:r>
-              <w:rPr>
-                <w:sz w:val="20"/>
-              </w:rPr>
-              <w:t>runtime,</w:t>
-            </w:r>
-            <w:r>
-              <w:rPr>
-                <w:spacing w:val="-9"/>
-                <w:sz w:val="20"/>
-              </w:rPr>
-              <w:t xml:space="preserve"> </w:t>
-            </w:r>
-            <w:r>
-              <w:rPr>
-                <w:sz w:val="20"/>
-              </w:rPr>
-              <w:t>and</w:t>
-            </w:r>
-            <w:r>
-              <w:rPr>
-                <w:spacing w:val="-9"/>
-                <w:sz w:val="20"/>
-              </w:rPr>
-              <w:t xml:space="preserve"> </w:t>
-            </w:r>
-            <w:r>
-              <w:rPr>
-                <w:sz w:val="20"/>
-              </w:rPr>
-              <w:t>maze-size scaling.</w:t>
-            </w:r>
+            </w:pPr>
           </w:p>
         </w:tc>
       </w:tr>
@@ -5697,27 +4985,25 @@
               <w:ind w:left="10" w:right="250"/>
               <w:rPr>
                 <w:sz w:val="20"/>
+                <w:lang w:val="en-IN"/>
               </w:rPr>
             </w:pPr>
             <w:r>
               <w:rPr>
                 <w:sz w:val="20"/>
-              </w:rPr>
-              <w:t>Beamer, Asanović &amp; Patterson, “Direction-Optimizing</w:t>
-            </w:r>
-            <w:r>
-              <w:rPr>
-                <w:spacing w:val="-13"/>
+                <w:lang w:val="en-IN"/>
+              </w:rPr>
+              <w:t>Beamer, Asanović &amp; Patterson, "Direction-Optimizing Breadth-First Search" (2013)</w:t>
+            </w:r>
+          </w:p>
+          <w:p>
+            <w:pPr>
+              <w:pStyle w:val="TableParagraph"/>
+              <w:ind w:left="10" w:right="250"/>
+              <w:rPr>
                 <w:sz w:val="20"/>
               </w:rPr>
-              <w:t xml:space="preserve"> </w:t>
-            </w:r>
-            <w:r>
-              <w:rPr>
-                <w:sz w:val="20"/>
-              </w:rPr>
-              <w:t>Breadth-First Search” (2013)</w:t>
-            </w:r>
+            </w:pPr>
           </w:p>
         </w:tc>
         <w:tc>
@@ -5730,66 +5016,25 @@
               <w:ind w:left="12" w:right="20"/>
               <w:rPr>
                 <w:sz w:val="20"/>
+                <w:lang w:val="en-IN"/>
               </w:rPr>
             </w:pPr>
             <w:r>
               <w:rPr>
                 <w:sz w:val="20"/>
-              </w:rPr>
-              <w:t>Introduced a hybrid BFS approach that</w:t>
-            </w:r>
-            <w:r>
-              <w:rPr>
-                <w:spacing w:val="-11"/>
+                <w:lang w:val="en-IN"/>
+              </w:rPr>
+              <w:t xml:space="preserve">Introduced a hybrid BFS algorithm that switches between top-down and bottom-up traversal to reduce the number of edges examined. </w:t>
+            </w:r>
+          </w:p>
+          <w:p>
+            <w:pPr>
+              <w:pStyle w:val="TableParagraph"/>
+              <w:ind w:left="12" w:right="20"/>
+              <w:rPr>
                 <w:sz w:val="20"/>
               </w:rPr>
-              <w:t xml:space="preserve"> </w:t>
-            </w:r>
-            <w:r>
-              <w:rPr>
-                <w:sz w:val="20"/>
-              </w:rPr>
-              <w:t>switches</w:t>
-            </w:r>
-            <w:r>
-              <w:rPr>
-                <w:spacing w:val="-11"/>
-                <w:sz w:val="20"/>
-              </w:rPr>
-              <w:t xml:space="preserve"> </w:t>
-            </w:r>
-            <w:r>
-              <w:rPr>
-                <w:sz w:val="20"/>
-              </w:rPr>
-              <w:t>between</w:t>
-            </w:r>
-            <w:r>
-              <w:rPr>
-                <w:spacing w:val="-10"/>
-                <w:sz w:val="20"/>
-              </w:rPr>
-              <w:t xml:space="preserve"> </w:t>
-            </w:r>
-            <w:r>
-              <w:rPr>
-                <w:sz w:val="20"/>
-              </w:rPr>
-              <w:t>top-down</w:t>
-            </w:r>
-            <w:r>
-              <w:rPr>
-                <w:spacing w:val="-10"/>
-                <w:sz w:val="20"/>
-              </w:rPr>
-              <w:t xml:space="preserve"> </w:t>
-            </w:r>
-            <w:r>
-              <w:rPr>
-                <w:sz w:val="20"/>
-              </w:rPr>
-              <w:t>and bottom-up traversal to reduce unnecessary edge examinations.</w:t>
-            </w:r>
+            </w:pPr>
           </w:p>
         </w:tc>
         <w:tc>
@@ -5802,79 +5047,25 @@
               <w:ind w:right="67"/>
               <w:rPr>
                 <w:sz w:val="20"/>
+                <w:lang w:val="en-IN"/>
               </w:rPr>
             </w:pPr>
             <w:r>
               <w:rPr>
                 <w:sz w:val="20"/>
-              </w:rPr>
-              <w:t>Large</w:t>
-            </w:r>
-            <w:r>
-              <w:rPr>
-                <w:spacing w:val="-13"/>
+                <w:lang w:val="en-IN"/>
+              </w:rPr>
+              <w:t>Standard synthetic graphs and real social-network graphs evaluated on multicore shared-memory systems.</w:t>
+            </w:r>
+          </w:p>
+          <w:p>
+            <w:pPr>
+              <w:pStyle w:val="TableParagraph"/>
+              <w:ind w:right="67"/>
+              <w:rPr>
                 <w:sz w:val="20"/>
               </w:rPr>
-              <w:t xml:space="preserve"> </w:t>
-            </w:r>
-            <w:r>
-              <w:rPr>
-                <w:sz w:val="20"/>
-              </w:rPr>
-              <w:t>synthetic</w:t>
-            </w:r>
-            <w:r>
-              <w:rPr>
-                <w:spacing w:val="-12"/>
-                <w:sz w:val="20"/>
-              </w:rPr>
-              <w:t xml:space="preserve"> </w:t>
-            </w:r>
-            <w:r>
-              <w:rPr>
-                <w:sz w:val="20"/>
-              </w:rPr>
-              <w:t>graphs</w:t>
-            </w:r>
-            <w:r>
-              <w:rPr>
-                <w:spacing w:val="-13"/>
-                <w:sz w:val="20"/>
-              </w:rPr>
-              <w:t xml:space="preserve"> </w:t>
-            </w:r>
-            <w:r>
-              <w:rPr>
-                <w:sz w:val="20"/>
-              </w:rPr>
-              <w:t>and real</w:t>
-            </w:r>
-            <w:r>
-              <w:rPr>
-                <w:spacing w:val="-2"/>
-                <w:sz w:val="20"/>
-              </w:rPr>
-              <w:t xml:space="preserve"> </w:t>
-            </w:r>
-            <w:r>
-              <w:rPr>
-                <w:sz w:val="20"/>
-              </w:rPr>
-              <w:t>social-network</w:t>
-            </w:r>
-            <w:r>
-              <w:rPr>
-                <w:spacing w:val="-1"/>
-                <w:sz w:val="20"/>
-              </w:rPr>
-              <w:t xml:space="preserve"> </w:t>
-            </w:r>
-            <w:r>
-              <w:rPr>
-                <w:sz w:val="20"/>
-              </w:rPr>
-              <w:t>graphs evaluated on multicore shared-memory systems.</w:t>
-            </w:r>
+            </w:pPr>
           </w:p>
         </w:tc>
         <w:tc>
@@ -5887,66 +5078,25 @@
               <w:ind w:left="12"/>
               <w:rPr>
                 <w:sz w:val="20"/>
+                <w:lang w:val="en-IN"/>
               </w:rPr>
             </w:pPr>
             <w:r>
               <w:rPr>
                 <w:sz w:val="20"/>
-              </w:rPr>
-              <w:t>Reported speedups of 3.3–7.8× on synthetic graphs and 2.4–4.6× on real</w:t>
-            </w:r>
-            <w:r>
-              <w:rPr>
-                <w:spacing w:val="-11"/>
+                <w:lang w:val="en-IN"/>
+              </w:rPr>
+              <w:t>Reported speedups of 3.3–7.8× on synthetic graphs and 2.4–4.6× on real social-network graphs compared with a strong baseline.</w:t>
+            </w:r>
+          </w:p>
+          <w:p>
+            <w:pPr>
+              <w:pStyle w:val="TableParagraph"/>
+              <w:ind w:left="12"/>
+              <w:rPr>
                 <w:sz w:val="20"/>
               </w:rPr>
-              <w:t xml:space="preserve"> </w:t>
-            </w:r>
-            <w:r>
-              <w:rPr>
-                <w:sz w:val="20"/>
-              </w:rPr>
-              <w:t>social-network</w:t>
-            </w:r>
-            <w:r>
-              <w:rPr>
-                <w:spacing w:val="-10"/>
-                <w:sz w:val="20"/>
-              </w:rPr>
-              <w:t xml:space="preserve"> </w:t>
-            </w:r>
-            <w:r>
-              <w:rPr>
-                <w:sz w:val="20"/>
-              </w:rPr>
-              <w:t>graphs</w:t>
-            </w:r>
-            <w:r>
-              <w:rPr>
-                <w:spacing w:val="-11"/>
-                <w:sz w:val="20"/>
-              </w:rPr>
-              <w:t xml:space="preserve"> </w:t>
-            </w:r>
-            <w:r>
-              <w:rPr>
-                <w:sz w:val="20"/>
-              </w:rPr>
-              <w:t>versus</w:t>
-            </w:r>
-            <w:r>
-              <w:rPr>
-                <w:spacing w:val="-11"/>
-                <w:sz w:val="20"/>
-              </w:rPr>
-              <w:t xml:space="preserve"> </w:t>
-            </w:r>
-            <w:r>
-              <w:rPr>
-                <w:sz w:val="20"/>
-              </w:rPr>
-              <w:t>a strong baseline.</w:t>
-            </w:r>
+            </w:pPr>
           </w:p>
         </w:tc>
         <w:tc>
@@ -5959,78 +5109,15 @@
               <w:ind w:right="165"/>
               <w:rPr>
                 <w:sz w:val="20"/>
+                <w:lang w:val="en-IN"/>
               </w:rPr>
             </w:pPr>
             <w:r>
               <w:rPr>
                 <w:sz w:val="20"/>
-              </w:rPr>
-              <w:t>Useful as an additional BFS optimization reference, but its large-graph</w:t>
-            </w:r>
-            <w:r>
-              <w:rPr>
-                <w:spacing w:val="-9"/>
-                <w:sz w:val="20"/>
-              </w:rPr>
-              <w:t xml:space="preserve"> </w:t>
-            </w:r>
-            <w:r>
-              <w:rPr>
-                <w:sz w:val="20"/>
-              </w:rPr>
-              <w:t>parallel</w:t>
-            </w:r>
-            <w:r>
-              <w:rPr>
-                <w:spacing w:val="-9"/>
-                <w:sz w:val="20"/>
-              </w:rPr>
-              <w:t xml:space="preserve"> </w:t>
-            </w:r>
-            <w:r>
-              <w:rPr>
-                <w:sz w:val="20"/>
-              </w:rPr>
-              <w:t>setting</w:t>
-            </w:r>
-            <w:r>
-              <w:rPr>
-                <w:spacing w:val="-9"/>
-                <w:sz w:val="20"/>
-              </w:rPr>
-              <w:t xml:space="preserve"> </w:t>
-            </w:r>
-            <w:r>
-              <w:rPr>
-                <w:sz w:val="20"/>
-              </w:rPr>
-              <w:t>differs</w:t>
-            </w:r>
-            <w:r>
-              <w:rPr>
-                <w:spacing w:val="-9"/>
-                <w:sz w:val="20"/>
-              </w:rPr>
-              <w:t xml:space="preserve"> </w:t>
-            </w:r>
-            <w:r>
-              <w:rPr>
-                <w:sz w:val="20"/>
-              </w:rPr>
-              <w:t>from</w:t>
-            </w:r>
-            <w:r>
-              <w:rPr>
-                <w:spacing w:val="-9"/>
-                <w:sz w:val="20"/>
-              </w:rPr>
-              <w:t xml:space="preserve"> </w:t>
-            </w:r>
-            <w:r>
-              <w:rPr>
-                <w:sz w:val="20"/>
-              </w:rPr>
-              <w:t>our small grid mazes; discuss it as</w:t>
+                <w:lang w:val="en-IN"/>
+              </w:rPr>
+              <w:t>Use this paper as background on BFS optimization, while noting that its large-graph processing setting differs from our maze grids. Do not claim its speedups apply to our project.</w:t>
             </w:r>
           </w:p>
           <w:p>
@@ -6041,51 +5128,6 @@
                 <w:sz w:val="20"/>
               </w:rPr>
             </w:pPr>
-            <w:r>
-              <w:rPr>
-                <w:sz w:val="20"/>
-              </w:rPr>
-              <w:t>background</w:t>
-            </w:r>
-            <w:r>
-              <w:rPr>
-                <w:spacing w:val="-13"/>
-                <w:sz w:val="20"/>
-              </w:rPr>
-              <w:t xml:space="preserve"> </w:t>
-            </w:r>
-            <w:r>
-              <w:rPr>
-                <w:sz w:val="20"/>
-              </w:rPr>
-              <w:t>rather</w:t>
-            </w:r>
-            <w:r>
-              <w:rPr>
-                <w:spacing w:val="-12"/>
-                <w:sz w:val="20"/>
-              </w:rPr>
-              <w:t xml:space="preserve"> </w:t>
-            </w:r>
-            <w:r>
-              <w:rPr>
-                <w:sz w:val="20"/>
-              </w:rPr>
-              <w:t>than</w:t>
-            </w:r>
-            <w:r>
-              <w:rPr>
-                <w:spacing w:val="-13"/>
-                <w:sz w:val="20"/>
-              </w:rPr>
-              <w:t xml:space="preserve"> </w:t>
-            </w:r>
-            <w:r>
-              <w:rPr>
-                <w:sz w:val="20"/>
-              </w:rPr>
-              <w:t>directly reproducing its results.</w:t>
-            </w:r>
           </w:p>
         </w:tc>
       </w:tr>
@@ -7911,15 +6953,7 @@
           <w:sz w:val="28"/>
           <w:szCs w:val="28"/>
         </w:rPr>
-        <w:t xml:space="preserve">            </w:t>
-      </w:r>
-      <w:r>
-        <w:rPr>
-          <w:color w:val="548DD4" w:themeColor="text2" w:themeTint="99"/>
-          <w:sz w:val="28"/>
-          <w:szCs w:val="28"/>
-        </w:rPr>
-        <w:t>Gymnasium Environments</w:t>
+        <w:t xml:space="preserve">            Gymnasium Environments</w:t>
       </w:r>
     </w:p>
     <w:p>

</xml_diff>